<commit_message>
ajout script de chargement des données CSV vers SQL
</commit_message>
<xml_diff>
--- a/Bellabeat/Documentation démarche data analyst.docx
+++ b/Bellabeat/Documentation démarche data analyst.docx
@@ -12,12 +12,22 @@
       </w:r>
       <w:proofErr w:type="spellEnd"/>
       <w:r>
-        <w:t xml:space="preserve"> = 1;</w:t>
-      </w:r>
-    </w:p>
-    <w:p>
-      <w:r>
-        <w:t xml:space="preserve">use </w:t>
+        <w:t xml:space="preserve"> = </w:t>
+      </w:r>
+      <w:proofErr w:type="gramStart"/>
+      <w:r>
+        <w:t>1;</w:t>
+      </w:r>
+      <w:proofErr w:type="gramEnd"/>
+    </w:p>
+    <w:p>
+      <w:proofErr w:type="gramStart"/>
+      <w:r>
+        <w:t>use</w:t>
+      </w:r>
+      <w:proofErr w:type="gramEnd"/>
+      <w:r>
+        <w:t xml:space="preserve"> </w:t>
       </w:r>
       <w:proofErr w:type="spellStart"/>
       <w:r>
@@ -141,7 +151,15 @@
       </w:r>
       <w:proofErr w:type="spellEnd"/>
       <w:r>
-        <w:t xml:space="preserve"> = STR_TO_DATE(@ActivityMinute, '%m/%d/%Y %r');</w:t>
+        <w:t xml:space="preserve"> = STR_TO_</w:t>
+      </w:r>
+      <w:proofErr w:type="gramStart"/>
+      <w:r>
+        <w:t>DATE(</w:t>
+      </w:r>
+      <w:proofErr w:type="gramEnd"/>
+      <w:r>
+        <w:t>@ActivityMinute, '%m/%d/%Y %r');</w:t>
       </w:r>
     </w:p>
     <w:p/>
@@ -151,13 +169,7 @@
       </w:r>
       <w:proofErr w:type="spellStart"/>
       <w:r>
-        <w:t>minute</w:t>
-      </w:r>
-      <w:r>
-        <w:t>_c</w:t>
-      </w:r>
-      <w:r>
-        <w:t>alories</w:t>
+        <w:t>minute_calories</w:t>
       </w:r>
       <w:proofErr w:type="spellEnd"/>
       <w:r>
@@ -264,13 +276,26 @@
       </w:r>
       <w:proofErr w:type="spellEnd"/>
       <w:r>
-        <w:t xml:space="preserve"> = STR_TO_DATE(@ActivityMinute, '%m/%d/%Y %r');</w:t>
-      </w:r>
-    </w:p>
-    <w:p>
+        <w:t xml:space="preserve"> = STR_TO_</w:t>
+      </w:r>
+      <w:proofErr w:type="gramStart"/>
+      <w:r>
+        <w:t>DATE(</w:t>
+      </w:r>
+      <w:proofErr w:type="gramEnd"/>
+      <w:r>
+        <w:t>@ActivityMinute, '%m/%d/%Y %r');</w:t>
+      </w:r>
+    </w:p>
+    <w:p>
+      <w:proofErr w:type="gramStart"/>
       <w:r>
         <w:lastRenderedPageBreak/>
-        <w:t xml:space="preserve">use </w:t>
+        <w:t>use</w:t>
+      </w:r>
+      <w:proofErr w:type="gramEnd"/>
+      <w:r>
+        <w:t xml:space="preserve"> </w:t>
       </w:r>
       <w:proofErr w:type="spellStart"/>
       <w:r>
@@ -403,7 +428,15 @@
       </w:r>
       <w:proofErr w:type="spellEnd"/>
       <w:r>
-        <w:t xml:space="preserve"> = STR_TO_DATE(@ActivityMinute, '%m/%d/%Y %r');</w:t>
+        <w:t xml:space="preserve"> = STR_TO_</w:t>
+      </w:r>
+      <w:proofErr w:type="gramStart"/>
+      <w:r>
+        <w:t>DATE(</w:t>
+      </w:r>
+      <w:proofErr w:type="gramEnd"/>
+      <w:r>
+        <w:t>@ActivityMinute, '%m/%d/%Y %r');</w:t>
       </w:r>
     </w:p>
     <w:p/>
@@ -1642,6 +1675,7 @@
   <w:style w:type="character" w:default="1" w:styleId="Policepardfaut">
     <w:name w:val="Default Paragraph Font"/>
     <w:uiPriority w:val="1"/>
+    <w:semiHidden/>
     <w:unhideWhenUsed/>
   </w:style>
   <w:style w:type="table" w:default="1" w:styleId="TableauNormal">

</xml_diff>